<commit_message>
Add .gitkeep to preserve empty directories
</commit_message>
<xml_diff>
--- a/docs/All_documentation_NotesAndComments.docx
+++ b/docs/All_documentation_NotesAndComments.docx
@@ -90,36 +90,38 @@
           <w:ilvl w:val="0"/>
           <w:numId w:val="1"/>
         </w:numPr>
-      </w:pPr>
-      <w:r>
+        <w:rPr>
+          <w:lang w:val="en-US"/>
+        </w:rPr>
+      </w:pPr>
+      <w:r>
+        <w:rPr>
+          <w:lang w:val="en-US"/>
+        </w:rPr>
         <w:t>A Review of Machine Learning and Deep Learning Trends in EEG-Based Epileptic Seizure Prediction</w:t>
       </w:r>
     </w:p>
-    <w:p/>
+    <w:p>
+      <w:pPr>
+        <w:rPr>
+          <w:lang w:val="en-US"/>
+        </w:rPr>
+      </w:pPr>
+    </w:p>
     <w:p>
       <w:pPr>
         <w:pStyle w:val="Ttulo2"/>
       </w:pPr>
-      <w:proofErr w:type="spellStart"/>
       <w:r>
         <w:t>Programación</w:t>
       </w:r>
-      <w:proofErr w:type="spellEnd"/>
     </w:p>
     <w:p>
       <w:pPr>
         <w:pStyle w:val="Ttulo3"/>
       </w:pPr>
       <w:r>
-        <w:t xml:space="preserve">Python </w:t>
-      </w:r>
-      <w:proofErr w:type="spellStart"/>
-      <w:r>
-        <w:t>imports</w:t>
-      </w:r>
-      <w:proofErr w:type="spellEnd"/>
-      <w:r>
-        <w:t xml:space="preserve"> - Santiago:</w:t>
+        <w:t>Python imports - Santiago:</w:t>
       </w:r>
     </w:p>
     <w:p>
@@ -130,21 +132,8 @@
           <w:numId w:val="4"/>
         </w:numPr>
       </w:pPr>
-      <w:proofErr w:type="spellStart"/>
-      <w:r>
-        <w:t>typing</w:t>
-      </w:r>
-      <w:proofErr w:type="spellEnd"/>
-      <w:r>
-        <w:t xml:space="preserve"> (List, </w:t>
-      </w:r>
-      <w:proofErr w:type="spellStart"/>
-      <w:r>
-        <w:t>Optional</w:t>
-      </w:r>
-      <w:proofErr w:type="spellEnd"/>
-      <w:r>
-        <w:t>)</w:t>
+      <w:r>
+        <w:t>typing (List, Optional)</w:t>
       </w:r>
     </w:p>
     <w:p>
@@ -155,21 +144,8 @@
           <w:numId w:val="4"/>
         </w:numPr>
       </w:pPr>
-      <w:proofErr w:type="spellStart"/>
-      <w:r>
-        <w:t>pydantic</w:t>
-      </w:r>
-      <w:proofErr w:type="spellEnd"/>
-      <w:r>
-        <w:t xml:space="preserve"> (</w:t>
-      </w:r>
-      <w:proofErr w:type="spellStart"/>
-      <w:r>
-        <w:t>BaseModel</w:t>
-      </w:r>
-      <w:proofErr w:type="spellEnd"/>
-      <w:r>
-        <w:t>)</w:t>
+      <w:r>
+        <w:t>pydantic (BaseModel)</w:t>
       </w:r>
     </w:p>
     <w:p>
@@ -180,11 +156,9 @@
           <w:numId w:val="4"/>
         </w:numPr>
       </w:pPr>
-      <w:proofErr w:type="spellStart"/>
       <w:r>
         <w:t>NumPy</w:t>
       </w:r>
-      <w:proofErr w:type="spellEnd"/>
     </w:p>
     <w:p>
       <w:pPr>
@@ -206,11 +180,9 @@
           <w:numId w:val="4"/>
         </w:numPr>
       </w:pPr>
-      <w:proofErr w:type="spellStart"/>
       <w:r>
         <w:t>FastApi</w:t>
       </w:r>
-      <w:proofErr w:type="spellEnd"/>
     </w:p>
     <w:p>
       <w:pPr>
@@ -220,11 +192,9 @@
           <w:numId w:val="4"/>
         </w:numPr>
       </w:pPr>
-      <w:proofErr w:type="spellStart"/>
       <w:r>
         <w:t>Pyedflib</w:t>
       </w:r>
-      <w:proofErr w:type="spellEnd"/>
     </w:p>
     <w:p>
       <w:pPr>
@@ -234,11 +204,9 @@
           <w:numId w:val="4"/>
         </w:numPr>
       </w:pPr>
-      <w:proofErr w:type="spellStart"/>
       <w:r>
         <w:t>Importlib</w:t>
       </w:r>
-      <w:proofErr w:type="spellEnd"/>
     </w:p>
     <w:p>
       <w:pPr>
@@ -248,11 +216,9 @@
           <w:numId w:val="4"/>
         </w:numPr>
       </w:pPr>
-      <w:proofErr w:type="spellStart"/>
       <w:r>
         <w:t>io</w:t>
       </w:r>
-      <w:proofErr w:type="spellEnd"/>
     </w:p>
     <w:p>
       <w:pPr>
@@ -262,11 +228,9 @@
           <w:numId w:val="4"/>
         </w:numPr>
       </w:pPr>
-      <w:proofErr w:type="spellStart"/>
       <w:r>
         <w:t>json</w:t>
       </w:r>
-      <w:proofErr w:type="spellEnd"/>
     </w:p>
     <w:p>
       <w:pPr>
@@ -276,11 +240,9 @@
           <w:numId w:val="4"/>
         </w:numPr>
       </w:pPr>
-      <w:proofErr w:type="spellStart"/>
       <w:r>
         <w:t>math</w:t>
       </w:r>
-      <w:proofErr w:type="spellEnd"/>
     </w:p>
     <w:p>
       <w:pPr>
@@ -302,11 +264,9 @@
           <w:numId w:val="4"/>
         </w:numPr>
       </w:pPr>
-      <w:proofErr w:type="spellStart"/>
       <w:r>
         <w:t>pickle</w:t>
       </w:r>
-      <w:proofErr w:type="spellEnd"/>
     </w:p>
     <w:p>
       <w:pPr>
@@ -316,11 +276,9 @@
           <w:numId w:val="4"/>
         </w:numPr>
       </w:pPr>
-      <w:proofErr w:type="spellStart"/>
       <w:r>
         <w:t>sys</w:t>
       </w:r>
-      <w:proofErr w:type="spellEnd"/>
     </w:p>
     <w:p>
       <w:pPr>
@@ -330,11 +288,9 @@
           <w:numId w:val="4"/>
         </w:numPr>
       </w:pPr>
-      <w:proofErr w:type="spellStart"/>
       <w:r>
         <w:t>tempfile</w:t>
       </w:r>
-      <w:proofErr w:type="spellEnd"/>
     </w:p>
     <w:p>
       <w:pPr>
@@ -344,11 +300,9 @@
           <w:numId w:val="4"/>
         </w:numPr>
       </w:pPr>
-      <w:proofErr w:type="spellStart"/>
       <w:r>
         <w:t>types</w:t>
       </w:r>
-      <w:proofErr w:type="spellEnd"/>
     </w:p>
     <w:p>
       <w:pPr>
@@ -358,11 +312,9 @@
           <w:numId w:val="4"/>
         </w:numPr>
       </w:pPr>
-      <w:proofErr w:type="spellStart"/>
       <w:r>
         <w:t>dataclasses</w:t>
       </w:r>
-      <w:proofErr w:type="spellEnd"/>
     </w:p>
     <w:p>
       <w:pPr>
@@ -372,11 +324,9 @@
           <w:numId w:val="4"/>
         </w:numPr>
       </w:pPr>
-      <w:proofErr w:type="spellStart"/>
       <w:r>
         <w:t>functools</w:t>
       </w:r>
-      <w:proofErr w:type="spellEnd"/>
     </w:p>
     <w:p>
       <w:pPr>
@@ -386,11 +336,9 @@
           <w:numId w:val="4"/>
         </w:numPr>
       </w:pPr>
-      <w:proofErr w:type="spellStart"/>
       <w:r>
         <w:t>pathlib</w:t>
       </w:r>
-      <w:proofErr w:type="spellEnd"/>
     </w:p>
     <w:p>
       <w:pPr>
@@ -400,11 +348,9 @@
           <w:numId w:val="4"/>
         </w:numPr>
       </w:pPr>
-      <w:proofErr w:type="spellStart"/>
       <w:r>
         <w:t>torch</w:t>
       </w:r>
-      <w:proofErr w:type="spellEnd"/>
     </w:p>
     <w:p>
       <w:pPr>
@@ -414,19 +360,9 @@
           <w:numId w:val="4"/>
         </w:numPr>
       </w:pPr>
-      <w:proofErr w:type="spellStart"/>
-      <w:r>
-        <w:t>torch</w:t>
-      </w:r>
-      <w:proofErr w:type="spellEnd"/>
-      <w:r>
-        <w:t xml:space="preserve"> </w:t>
-      </w:r>
-      <w:proofErr w:type="spellStart"/>
-      <w:r>
-        <w:t>nn</w:t>
-      </w:r>
-      <w:proofErr w:type="spellEnd"/>
+      <w:r>
+        <w:t>torch nn</w:t>
+      </w:r>
     </w:p>
     <w:p>
       <w:pPr>
@@ -436,11 +372,9 @@
           <w:numId w:val="4"/>
         </w:numPr>
       </w:pPr>
-      <w:proofErr w:type="spellStart"/>
       <w:r>
         <w:t>logging</w:t>
       </w:r>
-      <w:proofErr w:type="spellEnd"/>
     </w:p>
     <w:p/>
     <w:p/>
@@ -462,21 +396,9 @@
           <w:numId w:val="6"/>
         </w:numPr>
       </w:pPr>
-      <w:proofErr w:type="spellStart"/>
-      <w:r>
-        <w:t>Scikit-learn</w:t>
-      </w:r>
-      <w:proofErr w:type="spellEnd"/>
-      <w:proofErr w:type="gramStart"/>
-      <w:r>
-        <w:t>: .</w:t>
-      </w:r>
-      <w:proofErr w:type="spellStart"/>
-      <w:r>
-        <w:t>pkl</w:t>
-      </w:r>
-      <w:proofErr w:type="spellEnd"/>
-      <w:proofErr w:type="gramEnd"/>
+      <w:r>
+        <w:t>Scikit-learn: .pkl</w:t>
+      </w:r>
     </w:p>
     <w:p>
       <w:pPr>
@@ -486,13 +408,8 @@
           <w:numId w:val="5"/>
         </w:numPr>
       </w:pPr>
-      <w:proofErr w:type="spellStart"/>
-      <w:r>
-        <w:t>TensorFlow</w:t>
-      </w:r>
-      <w:proofErr w:type="spellEnd"/>
-      <w:r>
-        <w:t xml:space="preserve">: </w:t>
+      <w:r>
+        <w:t xml:space="preserve">TensorFlow: </w:t>
       </w:r>
       <w:r>
         <w:tab/>
@@ -507,13 +424,8 @@
           <w:numId w:val="5"/>
         </w:numPr>
       </w:pPr>
-      <w:proofErr w:type="spellStart"/>
-      <w:r>
-        <w:t>Keras</w:t>
-      </w:r>
-      <w:proofErr w:type="spellEnd"/>
-      <w:r>
-        <w:t>:</w:t>
+      <w:r>
+        <w:t>Keras:</w:t>
       </w:r>
       <w:r>
         <w:tab/>
@@ -528,27 +440,12 @@
           <w:numId w:val="5"/>
         </w:numPr>
       </w:pPr>
-      <w:proofErr w:type="spellStart"/>
-      <w:r>
-        <w:t>PyTorch</w:t>
-      </w:r>
-      <w:proofErr w:type="spellEnd"/>
-      <w:r>
-        <w:t>:</w:t>
-      </w:r>
-      <w:proofErr w:type="gramStart"/>
+      <w:r>
+        <w:t>PyTorch:</w:t>
+      </w:r>
       <w:r>
         <w:tab/>
-        <w:t>.</w:t>
-      </w:r>
-      <w:proofErr w:type="spellStart"/>
-      <w:r>
-        <w:t>pth</w:t>
-      </w:r>
-      <w:proofErr w:type="spellEnd"/>
-      <w:proofErr w:type="gramEnd"/>
-      <w:r>
-        <w:t>, .pt (Modelo y pesos)</w:t>
+        <w:t>.pth, .pt (Modelo y pesos)</w:t>
       </w:r>
     </w:p>
     <w:p/>
@@ -557,186 +454,124 @@
     <w:p>
       <w:pPr>
         <w:pStyle w:val="Ttulo3"/>
-      </w:pPr>
-      <w:r>
+        <w:rPr>
+          <w:lang w:val="en-US"/>
+        </w:rPr>
+      </w:pPr>
+      <w:r>
+        <w:rPr>
+          <w:lang w:val="en-US"/>
+        </w:rPr>
         <w:t>CURRENT IMPLEMENTATIONS IN GITHUB</w:t>
       </w:r>
     </w:p>
     <w:p>
-      <w:r>
+      <w:pPr>
+        <w:rPr>
+          <w:lang w:val="en-US"/>
+        </w:rPr>
+      </w:pPr>
+      <w:r>
+        <w:rPr>
+          <w:lang w:val="en-US"/>
+        </w:rPr>
         <w:t>Python versión 3.14.2</w:t>
       </w:r>
     </w:p>
+    <w:p>
+      <w:pPr>
+        <w:rPr>
+          <w:lang w:val="en-US"/>
+        </w:rPr>
+      </w:pPr>
+    </w:p>
+    <w:p>
+      <w:r>
+        <w:t>TRABAJO CON EL VIRTUAL ENVIRONMENT</w:t>
+      </w:r>
+    </w:p>
     <w:p/>
     <w:p>
       <w:r>
-        <w:t>TRABAJO CON EL VIRTUAL ENVIRONMENT</w:t>
+        <w:t>-&gt; Activación ** Al iniciar</w:t>
+      </w:r>
+    </w:p>
+    <w:p>
+      <w:pPr>
+        <w:ind w:left="708"/>
+        <w:rPr>
+          <w:lang w:val="en-US"/>
+        </w:rPr>
+      </w:pPr>
+      <w:r>
+        <w:rPr>
+          <w:lang w:val="en-US"/>
+        </w:rPr>
+        <w:t>/c/Users/ferch/Documents/Various/EngineeringDesignAndInnovation/hybrid-ai-epilepsy-diagnosis</w:t>
+      </w:r>
+    </w:p>
+    <w:p>
+      <w:pPr>
+        <w:rPr>
+          <w:lang w:val="en-US"/>
+        </w:rPr>
+      </w:pPr>
+    </w:p>
+    <w:p>
+      <w:pPr>
+        <w:ind w:firstLine="708"/>
+      </w:pPr>
+      <w:r>
+        <w:t>source venv/Scripts/activate</w:t>
       </w:r>
     </w:p>
     <w:p/>
     <w:p>
       <w:r>
-        <w:t>-&gt; Activación ** Al iniciar</w:t>
-      </w:r>
-    </w:p>
-    <w:p>
-      <w:pPr>
-        <w:ind w:left="708"/>
-        <w:rPr>
-          <w:lang w:val="en-US"/>
-        </w:rPr>
-      </w:pPr>
-      <w:r>
-        <w:rPr>
-          <w:lang w:val="en-US"/>
-        </w:rPr>
-        <w:t>/c/Users/ferch/Documents/Various/EngineeringDesignAndInnovation/hybrid-ai-epilepsy-diagnosis</w:t>
-      </w:r>
-    </w:p>
-    <w:p>
-      <w:pPr>
-        <w:rPr>
-          <w:lang w:val="en-US"/>
-        </w:rPr>
-      </w:pPr>
-    </w:p>
-    <w:p>
-      <w:pPr>
-        <w:ind w:firstLine="708"/>
-      </w:pPr>
-      <w:proofErr w:type="spellStart"/>
-      <w:r>
-        <w:t>source</w:t>
-      </w:r>
-      <w:proofErr w:type="spellEnd"/>
-      <w:r>
-        <w:t xml:space="preserve"> </w:t>
-      </w:r>
-      <w:proofErr w:type="spellStart"/>
-      <w:r>
-        <w:t>venv</w:t>
-      </w:r>
-      <w:proofErr w:type="spellEnd"/>
-      <w:r>
-        <w:t>/Scripts/</w:t>
-      </w:r>
-      <w:proofErr w:type="spellStart"/>
-      <w:r>
-        <w:t>activate</w:t>
-      </w:r>
-      <w:proofErr w:type="spellEnd"/>
+        <w:t>-&gt; Desactivación ** Antes de terminar</w:t>
+      </w:r>
+    </w:p>
+    <w:p>
+      <w:r>
+        <w:tab/>
+        <w:t>deactivate</w:t>
+      </w:r>
     </w:p>
     <w:p/>
     <w:p>
-      <w:r>
-        <w:t>-&gt; Desactivación ** Antes de terminar</w:t>
+      <w:pPr>
+        <w:pStyle w:val="Ttulo3"/>
+      </w:pPr>
+      <w:r>
+        <w:t>Creación y manejo de los entornos virtuales</w:t>
       </w:r>
     </w:p>
     <w:p>
       <w:r>
         <w:tab/>
-      </w:r>
-      <w:proofErr w:type="spellStart"/>
-      <w:r>
-        <w:t>deactivate</w:t>
-      </w:r>
-      <w:proofErr w:type="spellEnd"/>
+        <w:t>python -m venv .venv</w:t>
+      </w:r>
     </w:p>
     <w:p/>
     <w:p>
-      <w:pPr>
-        <w:pStyle w:val="Ttulo3"/>
-      </w:pPr>
-      <w:r>
-        <w:t>Creación</w:t>
-      </w:r>
-      <w:r>
-        <w:t xml:space="preserve"> y manejo de los entornos virtuales</w:t>
-      </w:r>
-    </w:p>
-    <w:p>
+      <w:r>
+        <w:t>Activación del virtual environment</w:t>
+      </w:r>
+    </w:p>
+    <w:p>
+      <w:pPr>
+        <w:rPr>
+          <w:lang w:val="en-US"/>
+        </w:rPr>
+      </w:pPr>
       <w:r>
         <w:tab/>
       </w:r>
-      <w:proofErr w:type="spellStart"/>
-      <w:r>
-        <w:t>python</w:t>
-      </w:r>
-      <w:proofErr w:type="spellEnd"/>
-      <w:r>
-        <w:t xml:space="preserve"> -m </w:t>
-      </w:r>
-      <w:proofErr w:type="spellStart"/>
-      <w:proofErr w:type="gramStart"/>
-      <w:r>
-        <w:t>venv</w:t>
-      </w:r>
-      <w:proofErr w:type="spellEnd"/>
-      <w:r>
-        <w:t xml:space="preserve"> .</w:t>
-      </w:r>
-      <w:proofErr w:type="spellStart"/>
-      <w:r>
-        <w:t>venv</w:t>
-      </w:r>
-      <w:proofErr w:type="spellEnd"/>
-      <w:proofErr w:type="gramEnd"/>
-    </w:p>
-    <w:p/>
-    <w:p>
-      <w:pPr>
-        <w:rPr>
-          <w:lang w:val="en-US"/>
-        </w:rPr>
-      </w:pPr>
-      <w:proofErr w:type="spellStart"/>
-      <w:r>
-        <w:rPr>
-          <w:lang w:val="en-US"/>
-        </w:rPr>
-        <w:t>Activación</w:t>
-      </w:r>
-      <w:proofErr w:type="spellEnd"/>
-      <w:r>
-        <w:rPr>
-          <w:lang w:val="en-US"/>
-        </w:rPr>
-        <w:t xml:space="preserve"> del virtual environment</w:t>
-      </w:r>
-    </w:p>
-    <w:p>
-      <w:pPr>
-        <w:rPr>
-          <w:lang w:val="en-US"/>
-        </w:rPr>
-      </w:pPr>
-      <w:r>
-        <w:rPr>
-          <w:lang w:val="en-US"/>
-        </w:rPr>
-        <w:tab/>
-      </w:r>
-      <w:proofErr w:type="gramStart"/>
-      <w:r>
-        <w:rPr>
-          <w:lang w:val="en-US"/>
-        </w:rPr>
-        <w:t>source .</w:t>
-      </w:r>
-      <w:proofErr w:type="spellStart"/>
-      <w:r>
-        <w:rPr>
-          <w:lang w:val="en-US"/>
-        </w:rPr>
-        <w:t>venv</w:t>
-      </w:r>
-      <w:proofErr w:type="spellEnd"/>
-      <w:proofErr w:type="gramEnd"/>
-      <w:r>
-        <w:rPr>
-          <w:lang w:val="en-US"/>
-        </w:rPr>
-        <w:t>/Scripts/activate</w:t>
+      <w:r>
+        <w:rPr>
+          <w:lang w:val="en-US"/>
+        </w:rPr>
+        <w:t>source .venv/Scripts/activate</w:t>
       </w:r>
     </w:p>
     <w:p>
@@ -796,22 +631,49 @@
     <w:p>
       <w:pPr>
         <w:ind w:firstLine="708"/>
-      </w:pPr>
-      <w:proofErr w:type="spellStart"/>
-      <w:r>
-        <w:t>pip</w:t>
-      </w:r>
-      <w:proofErr w:type="spellEnd"/>
-      <w:r>
-        <w:t xml:space="preserve"> </w:t>
-      </w:r>
-      <w:proofErr w:type="spellStart"/>
-      <w:r>
-        <w:t>freeze</w:t>
-      </w:r>
-      <w:proofErr w:type="spellEnd"/>
-      <w:r>
-        <w:t xml:space="preserve"> --local &gt; requirements.txt</w:t>
+        <w:rPr>
+          <w:lang w:val="en-US"/>
+        </w:rPr>
+      </w:pPr>
+      <w:r>
+        <w:rPr>
+          <w:lang w:val="en-US"/>
+        </w:rPr>
+        <w:t>pip freeze --local &gt; requirements.txt</w:t>
+      </w:r>
+    </w:p>
+    <w:p>
+      <w:pPr>
+        <w:rPr>
+          <w:lang w:val="en-US"/>
+        </w:rPr>
+      </w:pPr>
+    </w:p>
+    <w:p>
+      <w:pPr>
+        <w:rPr>
+          <w:lang w:val="en-US"/>
+        </w:rPr>
+      </w:pPr>
+    </w:p>
+    <w:p>
+      <w:pPr>
+        <w:pStyle w:val="Ttulo3"/>
+        <w:rPr>
+          <w:lang w:val="en-US"/>
+        </w:rPr>
+      </w:pPr>
+      <w:r>
+        <w:rPr>
+          <w:lang w:val="en-US"/>
+        </w:rPr>
+        <w:t>V</w:t>
+      </w:r>
+      <w:r>
+        <w:rPr>
+          <w:lang w:val="en-US"/>
+        </w:rPr>
+        <w:t>ersions or commits code</w:t>
       </w:r>
     </w:p>
     <w:p>
@@ -820,6 +682,65 @@
           <w:lang w:val="es-GT"/>
         </w:rPr>
       </w:pPr>
+      <w:r>
+        <w:rPr>
+          <w:lang w:val="es-GT"/>
+        </w:rPr>
+        <w:t>Add     → cuando agregas algo nuevo</w:t>
+      </w:r>
+    </w:p>
+    <w:p>
+      <w:pPr>
+        <w:rPr>
+          <w:lang w:val="es-GT"/>
+        </w:rPr>
+      </w:pPr>
+      <w:r>
+        <w:rPr>
+          <w:lang w:val="es-GT"/>
+        </w:rPr>
+        <w:t>Fix     → cuando corriges algo</w:t>
+      </w:r>
+    </w:p>
+    <w:p>
+      <w:pPr>
+        <w:rPr>
+          <w:lang w:val="es-GT"/>
+        </w:rPr>
+      </w:pPr>
+      <w:r>
+        <w:rPr>
+          <w:lang w:val="es-GT"/>
+        </w:rPr>
+        <w:lastRenderedPageBreak/>
+        <w:t>Update  → cuando modificas algo existente</w:t>
+      </w:r>
+    </w:p>
+    <w:p>
+      <w:pPr>
+        <w:rPr>
+          <w:lang w:val="es-GT"/>
+        </w:rPr>
+      </w:pPr>
+      <w:r>
+        <w:rPr>
+          <w:lang w:val="es-GT"/>
+        </w:rPr>
+        <w:t>Remove  → cuando eliminas algo</w:t>
+      </w:r>
+    </w:p>
+    <w:p>
+      <w:pPr>
+        <w:rPr>
+          <w:lang w:val="es-GT"/>
+        </w:rPr>
+      </w:pPr>
+      <w:r>
+        <w:rPr>
+          <w:lang w:val="es-GT"/>
+        </w:rPr>
+        <w:t>Init    → cuando inicializas algo</w:t>
+      </w:r>
     </w:p>
     <w:sectPr>
       <w:pgSz w:w="11906" w:h="16838"/>
@@ -2013,6 +1934,7 @@
   <w:style w:type="character" w:default="1" w:styleId="Fuentedeprrafopredeter">
     <w:name w:val="Default Paragraph Font"/>
     <w:uiPriority w:val="1"/>
+    <w:semiHidden/>
     <w:unhideWhenUsed/>
   </w:style>
   <w:style w:type="table" w:default="1" w:styleId="Tablanormal">

</xml_diff>